<commit_message>
feat: benchmark datasets + nedensel zincir + K1-K4 test raporu
- generate_dataset.py: tam nedensel zincir (rank->view->fav->cart->purchase->rating->sosyal kanit)
- Kategori bazli view_to_fav_rate, fav_to_cart_rate, cart_to_buy_rate parametreleri
- batch_test.py: 20 dataset toplu test (--kademeler/--periyotlar argumanlari)
- engine/features.py: _add_momentum vektorizasyon (~6x hiz artisi)
- validate_datasets.py: veri butunlugu dogrulama
- check_correlations.py: nedensel zincir korelasyon analizi
- results/benchmark_test_raporu.docx: K1-K4 benchmark sonuclari (renkli tablolar)
- README.md: benchmark sonuclari, yeni proje yapisi, yol haritasi guncellendi
- Gereksiz dosyalar temizlendi: catboost_info/, demo scriptler, eski data scriptleri
</commit_message>
<xml_diff>
--- a/LUMORA_Rekabet_Analizi_Raporu.docx
+++ b/LUMORA_Rekabet_Analizi_Raporu.docx
@@ -95,10 +95,7 @@
       </w:r>
       <w:r>
         <w:br/>
-        <w:t>değerlendirmekte ve sistemi dünya standartlarına taşımak için aşamalı bir gel</w:t>
-      </w:r>
-      <w:r>
-        <w:t xml:space="preserve">iştirme </w:t>
+        <w:t xml:space="preserve">değerlendirmekte ve sistemi dünya standartlarına taşımak için aşamalı bir geliştirme </w:t>
       </w:r>
       <w:r>
         <w:br/>
@@ -149,10 +146,7 @@
       </w:r>
       <w:r>
         <w:br/>
-        <w:t>Her ürün için günlük talep tahmini yapılır ve üretim 2</w:t>
-      </w:r>
-      <w:r>
-        <w:t xml:space="preserve">-4 hafta içinde gerçekleştirilir </w:t>
+        <w:t xml:space="preserve">Her ürün için günlük talep tahmini yapılır ve üretim 2-4 hafta içinde gerçekleştirilir </w:t>
       </w:r>
       <w:r>
         <w:br/>
@@ -468,13 +462,7 @@
               <w:rPr>
                 <w:sz w:val="20"/>
               </w:rPr>
-              <w:t>❌</w:t>
-            </w:r>
-            <w:r>
-              <w:rPr>
-                <w:sz w:val="20"/>
-              </w:rPr>
-              <w:t xml:space="preserve"> (Trendyol API kısıtlı)</w:t>
+              <w:t>❌ (Trendyol API kısıtlı)</w:t>
             </w:r>
           </w:p>
         </w:tc>
@@ -577,13 +565,7 @@
               <w:rPr>
                 <w:sz w:val="20"/>
               </w:rPr>
-              <w:t>❌</w:t>
-            </w:r>
-            <w:r>
-              <w:rPr>
-                <w:sz w:val="20"/>
-              </w:rPr>
-              <w:t xml:space="preserve"> (Eklenecek)</w:t>
+              <w:t>❌ (Eklenecek)</w:t>
             </w:r>
           </w:p>
         </w:tc>
@@ -634,13 +616,7 @@
               <w:rPr>
                 <w:sz w:val="20"/>
               </w:rPr>
-              <w:t>❌</w:t>
-            </w:r>
-            <w:r>
-              <w:rPr>
-                <w:sz w:val="20"/>
-              </w:rPr>
-              <w:t xml:space="preserve"> (Eklenecek)</w:t>
+              <w:t>❌ (Eklenecek)</w:t>
             </w:r>
           </w:p>
         </w:tc>
@@ -743,13 +719,7 @@
               <w:rPr>
                 <w:sz w:val="20"/>
               </w:rPr>
-              <w:t>❌</w:t>
-            </w:r>
-            <w:r>
-              <w:rPr>
-                <w:sz w:val="20"/>
-              </w:rPr>
-              <w:t xml:space="preserve"> (2 ay var)</w:t>
+              <w:t>❌ (2 ay var)</w:t>
             </w:r>
           </w:p>
         </w:tc>
@@ -766,15 +736,7 @@
           <w:color w:val="16213E"/>
           <w:sz w:val="30"/>
         </w:rPr>
-        <w:t xml:space="preserve">2.2 Amazon Fashion — Öneri </w:t>
-      </w:r>
-      <w:r>
-        <w:rPr>
-          <w:b/>
-          <w:color w:val="16213E"/>
-          <w:sz w:val="30"/>
-        </w:rPr>
-        <w:t>Motoru</w:t>
+        <w:t>2.2 Amazon Fashion — Öneri Motoru</w:t>
       </w:r>
     </w:p>
     <w:p>
@@ -812,10 +774,7 @@
         <w:spacing w:after="60"/>
       </w:pPr>
       <w:r>
-        <w:t>Multi-modal Embedding: fot</w:t>
-      </w:r>
-      <w:r>
-        <w:t>oğraf + metin + satış verisi aynı vektör uzayında</w:t>
+        <w:t>Multi-modal Embedding: fotoğraf + metin + satış verisi aynı vektör uzayında</w:t>
       </w:r>
     </w:p>
     <w:p>
@@ -863,10 +822,7 @@
         <w:spacing w:after="120"/>
       </w:pPr>
       <w:r>
-        <w:t>She</w:t>
-      </w:r>
-      <w:r>
-        <w:t xml:space="preserve">in'in farkı algoritmanın hızından değil, üretim döngüsünün kısalığından kaynaklanır. </w:t>
+        <w:t xml:space="preserve">Shein'in farkı algoritmanın hızından değil, üretim döngüsünün kısalığından kaynaklanır. </w:t>
       </w:r>
       <w:r>
         <w:br/>
@@ -883,10 +839,7 @@
         <w:spacing w:after="60"/>
       </w:pPr>
       <w:r>
-        <w:t>Algoritma: A/B test tabanlı üretim kararı (bizim feedback_t</w:t>
-      </w:r>
-      <w:r>
-        <w:t>op_n() ile aynı mantık!)</w:t>
+        <w:t>Algoritma: A/B test tabanlı üretim kararı (bizim feedback_top_n() ile aynı mantık!)</w:t>
       </w:r>
     </w:p>
     <w:p>
@@ -1214,13 +1167,7 @@
               <w:rPr>
                 <w:sz w:val="20"/>
               </w:rPr>
-              <w:t xml:space="preserve">Küresel moda </w:t>
-            </w:r>
-            <w:r>
-              <w:rPr>
-                <w:sz w:val="20"/>
-              </w:rPr>
-              <w:t>trendleri, 2 yıl öngörü</w:t>
+              <w:t>Küresel moda trendleri, 2 yıl öngörü</w:t>
             </w:r>
           </w:p>
         </w:tc>
@@ -1921,7 +1868,55 @@
               <w:rPr>
                 <w:sz w:val="20"/>
               </w:rPr>
-              <w:t>60 günlük tarihsel veriden composite demand skoru öğrenir</w:t>
+              <w:t>,</w:t>
+            </w:r>
+            <w:r>
+              <w:rPr>
+                <w:sz w:val="20"/>
+              </w:rPr>
+              <w:t xml:space="preserve">60 </w:t>
+            </w:r>
+            <w:proofErr w:type="spellStart"/>
+            <w:r>
+              <w:rPr>
+                <w:sz w:val="20"/>
+              </w:rPr>
+              <w:t>günlük</w:t>
+            </w:r>
+            <w:proofErr w:type="spellEnd"/>
+            <w:r>
+              <w:rPr>
+                <w:sz w:val="20"/>
+              </w:rPr>
+              <w:t xml:space="preserve"> </w:t>
+            </w:r>
+            <w:proofErr w:type="spellStart"/>
+            <w:r>
+              <w:rPr>
+                <w:sz w:val="20"/>
+              </w:rPr>
+              <w:t>tarihsel</w:t>
+            </w:r>
+            <w:proofErr w:type="spellEnd"/>
+            <w:r>
+              <w:rPr>
+                <w:sz w:val="20"/>
+              </w:rPr>
+              <w:t xml:space="preserve"> </w:t>
+            </w:r>
+            <w:proofErr w:type="spellStart"/>
+            <w:r>
+              <w:rPr>
+                <w:sz w:val="20"/>
+              </w:rPr>
+              <w:t>veriden</w:t>
+            </w:r>
+            <w:proofErr w:type="spellEnd"/>
+            <w:r>
+              <w:rPr>
+                <w:sz w:val="20"/>
+              </w:rPr>
+              <w:t xml:space="preserve"> composite demand skoru öğrenir</w:t>
             </w:r>
           </w:p>
         </w:tc>
@@ -2024,13 +2019,7 @@
               <w:rPr>
                 <w:sz w:val="20"/>
               </w:rPr>
-              <w:t xml:space="preserve">CatBoost + Kalman </w:t>
-            </w:r>
-            <w:r>
-              <w:rPr>
-                <w:sz w:val="20"/>
-              </w:rPr>
-              <w:t>ağırlıklı kombinasyonu</w:t>
+              <w:t>CatBoost + Kalman ağırlıklı kombinasyonu</w:t>
             </w:r>
           </w:p>
         </w:tc>
@@ -2180,14 +2169,7 @@
                 <w:color w:val="FFFFFF"/>
                 <w:sz w:val="20"/>
               </w:rPr>
-              <w:t>Düşüş Tesp</w:t>
-            </w:r>
-            <w:r>
-              <w:rPr>
-                <w:color w:val="FFFFFF"/>
-                <w:sz w:val="20"/>
-              </w:rPr>
-              <w:t>iti</w:t>
+              <w:t>Düşüş Tespiti</w:t>
             </w:r>
           </w:p>
         </w:tc>
@@ -2798,10 +2780,7 @@
       </w:pPr>
       <w:r>
         <w:lastRenderedPageBreak/>
-        <w:t xml:space="preserve">feedback_top_n() API'si: 'Bu ürün 2 sattı' → sistem </w:t>
-      </w:r>
-      <w:r>
-        <w:t>öğreniyor → bir daha önermez</w:t>
+        <w:t>feedback_top_n() API'si: 'Bu ürün 2 sattı' → sistem öğreniyor → bir daha önermez</w:t>
       </w:r>
     </w:p>
     <w:p>
@@ -2828,10 +2807,7 @@
         <w:spacing w:after="60"/>
       </w:pPr>
       <w:r>
-        <w:t xml:space="preserve">Pareto Farkındalığı: simülasyonda bile gerçek </w:t>
-      </w:r>
-      <w:r>
-        <w:t>Trendyol dağılımını (az ürün çok favori) modelleyebiliyor</w:t>
+        <w:t>Pareto Farkındalığı: simülasyonda bile gerçek Trendyol dağılımını (az ürün çok favori) modelleyebiliyor</w:t>
       </w:r>
     </w:p>
     <w:p>
@@ -2879,10 +2855,7 @@
         <w:spacing w:after="60"/>
       </w:pPr>
       <w:r>
-        <w:t>Yalnızca Trendy</w:t>
-      </w:r>
-      <w:r>
-        <w:t>ol: rakip platformlar (Hepsiburada, Amazon TR) kör nokta</w:t>
+        <w:t>Yalnızca Trendyol: rakip platformlar (Hepsiburada, Amazon TR) kör nokta</w:t>
       </w:r>
     </w:p>
     <w:p>
@@ -2919,15 +2892,7 @@
           <w:sz w:val="44"/>
         </w:rPr>
         <w:lastRenderedPageBreak/>
-        <w:t xml:space="preserve">4. Rekabet Matrisi — </w:t>
-      </w:r>
-      <w:r>
-        <w:rPr>
-          <w:b/>
-          <w:color w:val="1A1A2E"/>
-          <w:sz w:val="44"/>
-        </w:rPr>
-        <w:t>Algoritma mı, Veri mi?</w:t>
+        <w:t>4. Rekabet Matrisi — Algoritma mı, Veri mi?</w:t>
       </w:r>
     </w:p>
     <w:p>
@@ -2960,8 +2925,6 @@
       </w:r>
       <w:r>
         <w:br/>
-      </w:r>
-      <w:r>
         <w:t xml:space="preserve">üstün veri kalitesi ve çeşitliliğine dayanmaktadır. Sektör araştırmaları tutarlı biçimde </w:t>
       </w:r>
       <w:r>
@@ -3508,13 +3471,23 @@
               <w:rPr>
                 <w:sz w:val="20"/>
               </w:rPr>
-              <w:t>✅</w:t>
-            </w:r>
+              <w:t>✅ POS anlık</w:t>
+            </w:r>
+          </w:p>
+        </w:tc>
+        <w:tc>
+          <w:tcPr>
+            <w:tcW w:w="2016" w:type="dxa"/>
+          </w:tcPr>
+          <w:p>
+            <w:pPr>
+              <w:cnfStyle w:val="000000000000" w:firstRow="0" w:lastRow="0" w:firstColumn="0" w:lastColumn="0" w:oddVBand="0" w:evenVBand="0" w:oddHBand="0" w:evenHBand="0" w:firstRowFirstColumn="0" w:firstRowLastColumn="0" w:lastRowFirstColumn="0" w:lastRowLastColumn="0"/>
+            </w:pPr>
             <w:r>
               <w:rPr>
                 <w:sz w:val="20"/>
               </w:rPr>
-              <w:t xml:space="preserve"> POS anlık</w:t>
+              <w:t>✅ Anlık</w:t>
             </w:r>
           </w:p>
         </w:tc>
@@ -3530,57 +3503,23 @@
               <w:rPr>
                 <w:sz w:val="20"/>
               </w:rPr>
-              <w:t>✅</w:t>
-            </w:r>
+              <w:t>✅ 72s. test</w:t>
+            </w:r>
+          </w:p>
+        </w:tc>
+        <w:tc>
+          <w:tcPr>
+            <w:tcW w:w="2016" w:type="dxa"/>
+          </w:tcPr>
+          <w:p>
+            <w:pPr>
+              <w:cnfStyle w:val="000000000000" w:firstRow="0" w:lastRow="0" w:firstColumn="0" w:lastColumn="0" w:oddVBand="0" w:evenVBand="0" w:oddHBand="0" w:evenHBand="0" w:firstRowFirstColumn="0" w:firstRowLastColumn="0" w:lastRowFirstColumn="0" w:lastRowLastColumn="0"/>
+            </w:pPr>
             <w:r>
               <w:rPr>
                 <w:sz w:val="20"/>
               </w:rPr>
-              <w:t xml:space="preserve"> Anlık</w:t>
-            </w:r>
-          </w:p>
-        </w:tc>
-        <w:tc>
-          <w:tcPr>
-            <w:tcW w:w="2016" w:type="dxa"/>
-          </w:tcPr>
-          <w:p>
-            <w:pPr>
-              <w:cnfStyle w:val="000000000000" w:firstRow="0" w:lastRow="0" w:firstColumn="0" w:lastColumn="0" w:oddVBand="0" w:evenVBand="0" w:oddHBand="0" w:evenHBand="0" w:firstRowFirstColumn="0" w:firstRowLastColumn="0" w:lastRowFirstColumn="0" w:lastRowLastColumn="0"/>
-            </w:pPr>
-            <w:r>
-              <w:rPr>
-                <w:sz w:val="20"/>
-              </w:rPr>
-              <w:t>✅</w:t>
-            </w:r>
-            <w:r>
-              <w:rPr>
-                <w:sz w:val="20"/>
-              </w:rPr>
-              <w:t xml:space="preserve"> 72s. test</w:t>
-            </w:r>
-          </w:p>
-        </w:tc>
-        <w:tc>
-          <w:tcPr>
-            <w:tcW w:w="2016" w:type="dxa"/>
-          </w:tcPr>
-          <w:p>
-            <w:pPr>
-              <w:cnfStyle w:val="000000000000" w:firstRow="0" w:lastRow="0" w:firstColumn="0" w:lastColumn="0" w:oddVBand="0" w:evenVBand="0" w:oddHBand="0" w:evenHBand="0" w:firstRowFirstColumn="0" w:firstRowLastColumn="0" w:lastRowFirstColumn="0" w:lastRowLastColumn="0"/>
-            </w:pPr>
-            <w:r>
-              <w:rPr>
-                <w:sz w:val="20"/>
-              </w:rPr>
-              <w:t>❌</w:t>
-            </w:r>
-            <w:r>
-              <w:rPr>
-                <w:sz w:val="20"/>
-              </w:rPr>
-              <w:t xml:space="preserve"> Proxy</w:t>
+              <w:t>❌ Proxy</w:t>
             </w:r>
           </w:p>
         </w:tc>
@@ -3616,13 +3555,23 @@
               <w:rPr>
                 <w:sz w:val="20"/>
               </w:rPr>
-              <w:t>✅</w:t>
-            </w:r>
+              <w:t>✅ Evet</w:t>
+            </w:r>
+          </w:p>
+        </w:tc>
+        <w:tc>
+          <w:tcPr>
+            <w:tcW w:w="2016" w:type="dxa"/>
+          </w:tcPr>
+          <w:p>
+            <w:pPr>
+              <w:cnfStyle w:val="000000100000" w:firstRow="0" w:lastRow="0" w:firstColumn="0" w:lastColumn="0" w:oddVBand="0" w:evenVBand="0" w:oddHBand="1" w:evenHBand="0" w:firstRowFirstColumn="0" w:firstRowLastColumn="0" w:lastRowFirstColumn="0" w:lastRowLastColumn="0"/>
+            </w:pPr>
             <w:r>
               <w:rPr>
                 <w:sz w:val="20"/>
               </w:rPr>
-              <w:t xml:space="preserve"> Evet</w:t>
+              <w:t>⚠ Kısmi</w:t>
             </w:r>
           </w:p>
         </w:tc>
@@ -3638,57 +3587,23 @@
               <w:rPr>
                 <w:sz w:val="20"/>
               </w:rPr>
-              <w:t>⚠</w:t>
-            </w:r>
+              <w:t>✅ TikTok</w:t>
+            </w:r>
+          </w:p>
+        </w:tc>
+        <w:tc>
+          <w:tcPr>
+            <w:tcW w:w="2016" w:type="dxa"/>
+          </w:tcPr>
+          <w:p>
+            <w:pPr>
+              <w:cnfStyle w:val="000000100000" w:firstRow="0" w:lastRow="0" w:firstColumn="0" w:lastColumn="0" w:oddVBand="0" w:evenVBand="0" w:oddHBand="1" w:evenHBand="0" w:firstRowFirstColumn="0" w:firstRowLastColumn="0" w:lastRowFirstColumn="0" w:lastRowLastColumn="0"/>
+            </w:pPr>
             <w:r>
               <w:rPr>
                 <w:sz w:val="20"/>
               </w:rPr>
-              <w:t xml:space="preserve"> Kısmi</w:t>
-            </w:r>
-          </w:p>
-        </w:tc>
-        <w:tc>
-          <w:tcPr>
-            <w:tcW w:w="2016" w:type="dxa"/>
-          </w:tcPr>
-          <w:p>
-            <w:pPr>
-              <w:cnfStyle w:val="000000100000" w:firstRow="0" w:lastRow="0" w:firstColumn="0" w:lastColumn="0" w:oddVBand="0" w:evenVBand="0" w:oddHBand="1" w:evenHBand="0" w:firstRowFirstColumn="0" w:firstRowLastColumn="0" w:lastRowFirstColumn="0" w:lastRowLastColumn="0"/>
-            </w:pPr>
-            <w:r>
-              <w:rPr>
-                <w:sz w:val="20"/>
-              </w:rPr>
-              <w:t>✅</w:t>
-            </w:r>
-            <w:r>
-              <w:rPr>
-                <w:sz w:val="20"/>
-              </w:rPr>
-              <w:t xml:space="preserve"> TikTok</w:t>
-            </w:r>
-          </w:p>
-        </w:tc>
-        <w:tc>
-          <w:tcPr>
-            <w:tcW w:w="2016" w:type="dxa"/>
-          </w:tcPr>
-          <w:p>
-            <w:pPr>
-              <w:cnfStyle w:val="000000100000" w:firstRow="0" w:lastRow="0" w:firstColumn="0" w:lastColumn="0" w:oddVBand="0" w:evenVBand="0" w:oddHBand="1" w:evenHBand="0" w:firstRowFirstColumn="0" w:firstRowLastColumn="0" w:lastRowFirstColumn="0" w:lastRowLastColumn="0"/>
-            </w:pPr>
-            <w:r>
-              <w:rPr>
-                <w:sz w:val="20"/>
-              </w:rPr>
-              <w:t>❌</w:t>
-            </w:r>
-            <w:r>
-              <w:rPr>
-                <w:sz w:val="20"/>
-              </w:rPr>
-              <w:t xml:space="preserve"> Yok</w:t>
+              <w:t>❌ Yok</w:t>
             </w:r>
           </w:p>
         </w:tc>
@@ -3723,13 +3638,23 @@
               <w:rPr>
                 <w:sz w:val="20"/>
               </w:rPr>
-              <w:t>✅</w:t>
-            </w:r>
+              <w:t>✅ Fiziksel</w:t>
+            </w:r>
+          </w:p>
+        </w:tc>
+        <w:tc>
+          <w:tcPr>
+            <w:tcW w:w="2016" w:type="dxa"/>
+          </w:tcPr>
+          <w:p>
+            <w:pPr>
+              <w:cnfStyle w:val="000000000000" w:firstRow="0" w:lastRow="0" w:firstColumn="0" w:lastColumn="0" w:oddVBand="0" w:evenVBand="0" w:oddHBand="0" w:evenHBand="0" w:firstRowFirstColumn="0" w:firstRowLastColumn="0" w:lastRowFirstColumn="0" w:lastRowLastColumn="0"/>
+            </w:pPr>
             <w:r>
               <w:rPr>
                 <w:sz w:val="20"/>
               </w:rPr>
-              <w:t xml:space="preserve"> Fiziksel</w:t>
+              <w:t>✅ Amazon</w:t>
             </w:r>
           </w:p>
         </w:tc>
@@ -3745,57 +3670,23 @@
               <w:rPr>
                 <w:sz w:val="20"/>
               </w:rPr>
-              <w:t>✅</w:t>
-            </w:r>
+              <w:t>✅ Global</w:t>
+            </w:r>
+          </w:p>
+        </w:tc>
+        <w:tc>
+          <w:tcPr>
+            <w:tcW w:w="2016" w:type="dxa"/>
+          </w:tcPr>
+          <w:p>
+            <w:pPr>
+              <w:cnfStyle w:val="000000000000" w:firstRow="0" w:lastRow="0" w:firstColumn="0" w:lastColumn="0" w:oddVBand="0" w:evenVBand="0" w:oddHBand="0" w:evenHBand="0" w:firstRowFirstColumn="0" w:firstRowLastColumn="0" w:lastRowFirstColumn="0" w:lastRowLastColumn="0"/>
+            </w:pPr>
             <w:r>
               <w:rPr>
                 <w:sz w:val="20"/>
               </w:rPr>
-              <w:t xml:space="preserve"> Amazon</w:t>
-            </w:r>
-          </w:p>
-        </w:tc>
-        <w:tc>
-          <w:tcPr>
-            <w:tcW w:w="2016" w:type="dxa"/>
-          </w:tcPr>
-          <w:p>
-            <w:pPr>
-              <w:cnfStyle w:val="000000000000" w:firstRow="0" w:lastRow="0" w:firstColumn="0" w:lastColumn="0" w:oddVBand="0" w:evenVBand="0" w:oddHBand="0" w:evenHBand="0" w:firstRowFirstColumn="0" w:firstRowLastColumn="0" w:lastRowFirstColumn="0" w:lastRowLastColumn="0"/>
-            </w:pPr>
-            <w:r>
-              <w:rPr>
-                <w:sz w:val="20"/>
-              </w:rPr>
-              <w:t>✅</w:t>
-            </w:r>
-            <w:r>
-              <w:rPr>
-                <w:sz w:val="20"/>
-              </w:rPr>
-              <w:t xml:space="preserve"> Global</w:t>
-            </w:r>
-          </w:p>
-        </w:tc>
-        <w:tc>
-          <w:tcPr>
-            <w:tcW w:w="2016" w:type="dxa"/>
-          </w:tcPr>
-          <w:p>
-            <w:pPr>
-              <w:cnfStyle w:val="000000000000" w:firstRow="0" w:lastRow="0" w:firstColumn="0" w:lastColumn="0" w:oddVBand="0" w:evenVBand="0" w:oddHBand="0" w:evenHBand="0" w:firstRowFirstColumn="0" w:firstRowLastColumn="0" w:lastRowFirstColumn="0" w:lastRowLastColumn="0"/>
-            </w:pPr>
-            <w:r>
-              <w:rPr>
-                <w:sz w:val="20"/>
-              </w:rPr>
-              <w:t>✅</w:t>
-            </w:r>
-            <w:r>
-              <w:rPr>
-                <w:sz w:val="20"/>
-              </w:rPr>
-              <w:t xml:space="preserve"> Trendyol</w:t>
+              <w:t>✅ Trendyol</w:t>
             </w:r>
           </w:p>
         </w:tc>
@@ -3831,13 +3722,23 @@
               <w:rPr>
                 <w:sz w:val="20"/>
               </w:rPr>
-              <w:t>✅</w:t>
-            </w:r>
+              <w:t>✅ İade+POS</w:t>
+            </w:r>
+          </w:p>
+        </w:tc>
+        <w:tc>
+          <w:tcPr>
+            <w:tcW w:w="2016" w:type="dxa"/>
+          </w:tcPr>
+          <w:p>
+            <w:pPr>
+              <w:cnfStyle w:val="000000100000" w:firstRow="0" w:lastRow="0" w:firstColumn="0" w:lastColumn="0" w:oddVBand="0" w:evenVBand="0" w:oddHBand="1" w:evenHBand="0" w:firstRowFirstColumn="0" w:firstRowLastColumn="0" w:lastRowFirstColumn="0" w:lastRowLastColumn="0"/>
+            </w:pPr>
             <w:r>
               <w:rPr>
                 <w:sz w:val="20"/>
               </w:rPr>
-              <w:t xml:space="preserve"> İade+POS</w:t>
+              <w:t>✅ Click</w:t>
             </w:r>
           </w:p>
         </w:tc>
@@ -3853,57 +3754,23 @@
               <w:rPr>
                 <w:sz w:val="20"/>
               </w:rPr>
-              <w:t>✅</w:t>
-            </w:r>
+              <w:t>✅ A/B test</w:t>
+            </w:r>
+          </w:p>
+        </w:tc>
+        <w:tc>
+          <w:tcPr>
+            <w:tcW w:w="2016" w:type="dxa"/>
+          </w:tcPr>
+          <w:p>
+            <w:pPr>
+              <w:cnfStyle w:val="000000100000" w:firstRow="0" w:lastRow="0" w:firstColumn="0" w:lastColumn="0" w:oddVBand="0" w:evenVBand="0" w:oddHBand="1" w:evenHBand="0" w:firstRowFirstColumn="0" w:firstRowLastColumn="0" w:lastRowFirstColumn="0" w:lastRowLastColumn="0"/>
+            </w:pPr>
             <w:r>
               <w:rPr>
                 <w:sz w:val="20"/>
               </w:rPr>
-              <w:t xml:space="preserve"> Click</w:t>
-            </w:r>
-          </w:p>
-        </w:tc>
-        <w:tc>
-          <w:tcPr>
-            <w:tcW w:w="2016" w:type="dxa"/>
-          </w:tcPr>
-          <w:p>
-            <w:pPr>
-              <w:cnfStyle w:val="000000100000" w:firstRow="0" w:lastRow="0" w:firstColumn="0" w:lastColumn="0" w:oddVBand="0" w:evenVBand="0" w:oddHBand="1" w:evenHBand="0" w:firstRowFirstColumn="0" w:firstRowLastColumn="0" w:lastRowFirstColumn="0" w:lastRowLastColumn="0"/>
-            </w:pPr>
-            <w:r>
-              <w:rPr>
-                <w:sz w:val="20"/>
-              </w:rPr>
-              <w:t>✅</w:t>
-            </w:r>
-            <w:r>
-              <w:rPr>
-                <w:sz w:val="20"/>
-              </w:rPr>
-              <w:t xml:space="preserve"> A/B test</w:t>
-            </w:r>
-          </w:p>
-        </w:tc>
-        <w:tc>
-          <w:tcPr>
-            <w:tcW w:w="2016" w:type="dxa"/>
-          </w:tcPr>
-          <w:p>
-            <w:pPr>
-              <w:cnfStyle w:val="000000100000" w:firstRow="0" w:lastRow="0" w:firstColumn="0" w:lastColumn="0" w:oddVBand="0" w:evenVBand="0" w:oddHBand="1" w:evenHBand="0" w:firstRowFirstColumn="0" w:firstRowLastColumn="0" w:lastRowFirstColumn="0" w:lastRowLastColumn="0"/>
-            </w:pPr>
-            <w:r>
-              <w:rPr>
-                <w:sz w:val="20"/>
-              </w:rPr>
-              <w:t>✅</w:t>
-            </w:r>
-            <w:r>
-              <w:rPr>
-                <w:sz w:val="20"/>
-              </w:rPr>
-              <w:t xml:space="preserve"> Manual</w:t>
+              <w:t>✅ Manual</w:t>
             </w:r>
           </w:p>
         </w:tc>
@@ -3938,13 +3805,23 @@
               <w:rPr>
                 <w:sz w:val="20"/>
               </w:rPr>
-              <w:t>✅</w:t>
-            </w:r>
+              <w:t>✅ 30+ yıl</w:t>
+            </w:r>
+          </w:p>
+        </w:tc>
+        <w:tc>
+          <w:tcPr>
+            <w:tcW w:w="2016" w:type="dxa"/>
+          </w:tcPr>
+          <w:p>
+            <w:pPr>
+              <w:cnfStyle w:val="000000000000" w:firstRow="0" w:lastRow="0" w:firstColumn="0" w:lastColumn="0" w:oddVBand="0" w:evenVBand="0" w:oddHBand="0" w:evenHBand="0" w:firstRowFirstColumn="0" w:firstRowLastColumn="0" w:lastRowFirstColumn="0" w:lastRowLastColumn="0"/>
+            </w:pPr>
             <w:r>
               <w:rPr>
                 <w:sz w:val="20"/>
               </w:rPr>
-              <w:t xml:space="preserve"> 30+ yıl</w:t>
+              <w:t>✅ 25+ yıl</w:t>
             </w:r>
           </w:p>
         </w:tc>
@@ -3960,57 +3837,23 @@
               <w:rPr>
                 <w:sz w:val="20"/>
               </w:rPr>
-              <w:t>✅</w:t>
-            </w:r>
+              <w:t>⚠ 10 yıl</w:t>
+            </w:r>
+          </w:p>
+        </w:tc>
+        <w:tc>
+          <w:tcPr>
+            <w:tcW w:w="2016" w:type="dxa"/>
+          </w:tcPr>
+          <w:p>
+            <w:pPr>
+              <w:cnfStyle w:val="000000000000" w:firstRow="0" w:lastRow="0" w:firstColumn="0" w:lastColumn="0" w:oddVBand="0" w:evenVBand="0" w:oddHBand="0" w:evenHBand="0" w:firstRowFirstColumn="0" w:firstRowLastColumn="0" w:lastRowFirstColumn="0" w:lastRowLastColumn="0"/>
+            </w:pPr>
             <w:r>
               <w:rPr>
                 <w:sz w:val="20"/>
               </w:rPr>
-              <w:t xml:space="preserve"> 25+ yıl</w:t>
-            </w:r>
-          </w:p>
-        </w:tc>
-        <w:tc>
-          <w:tcPr>
-            <w:tcW w:w="2016" w:type="dxa"/>
-          </w:tcPr>
-          <w:p>
-            <w:pPr>
-              <w:cnfStyle w:val="000000000000" w:firstRow="0" w:lastRow="0" w:firstColumn="0" w:lastColumn="0" w:oddVBand="0" w:evenVBand="0" w:oddHBand="0" w:evenHBand="0" w:firstRowFirstColumn="0" w:firstRowLastColumn="0" w:lastRowFirstColumn="0" w:lastRowLastColumn="0"/>
-            </w:pPr>
-            <w:r>
-              <w:rPr>
-                <w:sz w:val="20"/>
-              </w:rPr>
-              <w:t>⚠</w:t>
-            </w:r>
-            <w:r>
-              <w:rPr>
-                <w:sz w:val="20"/>
-              </w:rPr>
-              <w:t xml:space="preserve"> 10 yıl</w:t>
-            </w:r>
-          </w:p>
-        </w:tc>
-        <w:tc>
-          <w:tcPr>
-            <w:tcW w:w="2016" w:type="dxa"/>
-          </w:tcPr>
-          <w:p>
-            <w:pPr>
-              <w:cnfStyle w:val="000000000000" w:firstRow="0" w:lastRow="0" w:firstColumn="0" w:lastColumn="0" w:oddVBand="0" w:evenVBand="0" w:oddHBand="0" w:evenHBand="0" w:firstRowFirstColumn="0" w:firstRowLastColumn="0" w:lastRowFirstColumn="0" w:lastRowLastColumn="0"/>
-            </w:pPr>
-            <w:r>
-              <w:rPr>
-                <w:sz w:val="20"/>
-              </w:rPr>
-              <w:t>❌</w:t>
-            </w:r>
-            <w:r>
-              <w:rPr>
-                <w:sz w:val="20"/>
-              </w:rPr>
-              <w:t xml:space="preserve"> 60 gün</w:t>
+              <w:t>❌ 60 gün</w:t>
             </w:r>
           </w:p>
         </w:tc>
@@ -4046,13 +3889,23 @@
               <w:rPr>
                 <w:sz w:val="20"/>
               </w:rPr>
-              <w:t>✅</w:t>
-            </w:r>
+              <w:t>✅ Entegre</w:t>
+            </w:r>
+          </w:p>
+        </w:tc>
+        <w:tc>
+          <w:tcPr>
+            <w:tcW w:w="2016" w:type="dxa"/>
+          </w:tcPr>
+          <w:p>
+            <w:pPr>
+              <w:cnfStyle w:val="000000100000" w:firstRow="0" w:lastRow="0" w:firstColumn="0" w:lastColumn="0" w:oddVBand="0" w:evenVBand="0" w:oddHBand="1" w:evenHBand="0" w:firstRowFirstColumn="0" w:firstRowLastColumn="0" w:lastRowFirstColumn="0" w:lastRowLastColumn="0"/>
+            </w:pPr>
             <w:r>
               <w:rPr>
                 <w:sz w:val="20"/>
               </w:rPr>
-              <w:t xml:space="preserve"> Entegre</w:t>
+              <w:t>⚠ Kısmi</w:t>
             </w:r>
           </w:p>
         </w:tc>
@@ -4068,57 +3921,23 @@
               <w:rPr>
                 <w:sz w:val="20"/>
               </w:rPr>
-              <w:t>⚠</w:t>
-            </w:r>
+              <w:t>❌ Yok</w:t>
+            </w:r>
+          </w:p>
+        </w:tc>
+        <w:tc>
+          <w:tcPr>
+            <w:tcW w:w="2016" w:type="dxa"/>
+          </w:tcPr>
+          <w:p>
+            <w:pPr>
+              <w:cnfStyle w:val="000000100000" w:firstRow="0" w:lastRow="0" w:firstColumn="0" w:lastColumn="0" w:oddVBand="0" w:evenVBand="0" w:oddHBand="1" w:evenHBand="0" w:firstRowFirstColumn="0" w:firstRowLastColumn="0" w:lastRowFirstColumn="0" w:lastRowLastColumn="0"/>
+            </w:pPr>
             <w:r>
               <w:rPr>
                 <w:sz w:val="20"/>
               </w:rPr>
-              <w:t xml:space="preserve"> Kısmi</w:t>
-            </w:r>
-          </w:p>
-        </w:tc>
-        <w:tc>
-          <w:tcPr>
-            <w:tcW w:w="2016" w:type="dxa"/>
-          </w:tcPr>
-          <w:p>
-            <w:pPr>
-              <w:cnfStyle w:val="000000100000" w:firstRow="0" w:lastRow="0" w:firstColumn="0" w:lastColumn="0" w:oddVBand="0" w:evenVBand="0" w:oddHBand="1" w:evenHBand="0" w:firstRowFirstColumn="0" w:firstRowLastColumn="0" w:lastRowFirstColumn="0" w:lastRowLastColumn="0"/>
-            </w:pPr>
-            <w:r>
-              <w:rPr>
-                <w:sz w:val="20"/>
-              </w:rPr>
-              <w:t>❌</w:t>
-            </w:r>
-            <w:r>
-              <w:rPr>
-                <w:sz w:val="20"/>
-              </w:rPr>
-              <w:t xml:space="preserve"> Yok</w:t>
-            </w:r>
-          </w:p>
-        </w:tc>
-        <w:tc>
-          <w:tcPr>
-            <w:tcW w:w="2016" w:type="dxa"/>
-          </w:tcPr>
-          <w:p>
-            <w:pPr>
-              <w:cnfStyle w:val="000000100000" w:firstRow="0" w:lastRow="0" w:firstColumn="0" w:lastColumn="0" w:oddVBand="0" w:evenVBand="0" w:oddHBand="1" w:evenHBand="0" w:firstRowFirstColumn="0" w:firstRowLastColumn="0" w:lastRowFirstColumn="0" w:lastRowLastColumn="0"/>
-            </w:pPr>
-            <w:r>
-              <w:rPr>
-                <w:sz w:val="20"/>
-              </w:rPr>
-              <w:t>❌</w:t>
-            </w:r>
-            <w:r>
-              <w:rPr>
-                <w:sz w:val="20"/>
-              </w:rPr>
-              <w:t xml:space="preserve"> Yok</w:t>
+              <w:t>❌ Yok</w:t>
             </w:r>
           </w:p>
         </w:tc>
@@ -4153,13 +3972,23 @@
               <w:rPr>
                 <w:sz w:val="20"/>
               </w:rPr>
-              <w:t>⚠</w:t>
-            </w:r>
+              <w:t>⚠ Orta</w:t>
+            </w:r>
+          </w:p>
+        </w:tc>
+        <w:tc>
+          <w:tcPr>
+            <w:tcW w:w="2016" w:type="dxa"/>
+          </w:tcPr>
+          <w:p>
+            <w:pPr>
+              <w:cnfStyle w:val="000000000000" w:firstRow="0" w:lastRow="0" w:firstColumn="0" w:lastColumn="0" w:oddVBand="0" w:evenVBand="0" w:oddHBand="0" w:evenHBand="0" w:firstRowFirstColumn="0" w:firstRowLastColumn="0" w:lastRowFirstColumn="0" w:lastRowLastColumn="0"/>
+            </w:pPr>
             <w:r>
               <w:rPr>
                 <w:sz w:val="20"/>
               </w:rPr>
-              <w:t xml:space="preserve"> Orta</w:t>
+              <w:t>✅ Yüksek</w:t>
             </w:r>
           </w:p>
         </w:tc>
@@ -4175,57 +4004,23 @@
               <w:rPr>
                 <w:sz w:val="20"/>
               </w:rPr>
-              <w:t>✅</w:t>
-            </w:r>
+              <w:t>⚠ Basit A/B</w:t>
+            </w:r>
+          </w:p>
+        </w:tc>
+        <w:tc>
+          <w:tcPr>
+            <w:tcW w:w="2016" w:type="dxa"/>
+          </w:tcPr>
+          <w:p>
+            <w:pPr>
+              <w:cnfStyle w:val="000000000000" w:firstRow="0" w:lastRow="0" w:firstColumn="0" w:lastColumn="0" w:oddVBand="0" w:evenVBand="0" w:oddHBand="0" w:evenHBand="0" w:firstRowFirstColumn="0" w:firstRowLastColumn="0" w:lastRowFirstColumn="0" w:lastRowLastColumn="0"/>
+            </w:pPr>
             <w:r>
               <w:rPr>
                 <w:sz w:val="20"/>
               </w:rPr>
-              <w:t xml:space="preserve"> Yüksek</w:t>
-            </w:r>
-          </w:p>
-        </w:tc>
-        <w:tc>
-          <w:tcPr>
-            <w:tcW w:w="2016" w:type="dxa"/>
-          </w:tcPr>
-          <w:p>
-            <w:pPr>
-              <w:cnfStyle w:val="000000000000" w:firstRow="0" w:lastRow="0" w:firstColumn="0" w:lastColumn="0" w:oddVBand="0" w:evenVBand="0" w:oddHBand="0" w:evenHBand="0" w:firstRowFirstColumn="0" w:firstRowLastColumn="0" w:lastRowFirstColumn="0" w:lastRowLastColumn="0"/>
-            </w:pPr>
-            <w:r>
-              <w:rPr>
-                <w:sz w:val="20"/>
-              </w:rPr>
-              <w:t>⚠</w:t>
-            </w:r>
-            <w:r>
-              <w:rPr>
-                <w:sz w:val="20"/>
-              </w:rPr>
-              <w:t xml:space="preserve"> Basit A/B</w:t>
-            </w:r>
-          </w:p>
-        </w:tc>
-        <w:tc>
-          <w:tcPr>
-            <w:tcW w:w="2016" w:type="dxa"/>
-          </w:tcPr>
-          <w:p>
-            <w:pPr>
-              <w:cnfStyle w:val="000000000000" w:firstRow="0" w:lastRow="0" w:firstColumn="0" w:lastColumn="0" w:oddVBand="0" w:evenVBand="0" w:oddHBand="0" w:evenHBand="0" w:firstRowFirstColumn="0" w:firstRowLastColumn="0" w:lastRowFirstColumn="0" w:lastRowLastColumn="0"/>
-            </w:pPr>
-            <w:r>
-              <w:rPr>
-                <w:sz w:val="20"/>
-              </w:rPr>
-              <w:t>✅</w:t>
-            </w:r>
-            <w:r>
-              <w:rPr>
-                <w:sz w:val="20"/>
-              </w:rPr>
-              <w:t xml:space="preserve"> Yüksek</w:t>
+              <w:t>✅ Yüksek</w:t>
             </w:r>
           </w:p>
         </w:tc>
@@ -4241,14 +4036,7 @@
           <w:i/>
           <w:color w:val="0F3C78"/>
         </w:rPr>
-        <w:t>📌</w:t>
-      </w:r>
-      <w:r>
-        <w:rPr>
-          <w:i/>
-          <w:color w:val="0F3C78"/>
-        </w:rPr>
-        <w:t xml:space="preserve"> Kritik Bulgu: Lumora Intelligence'ın algoritma karmaşıklığı büyük oyuncularla </w:t>
+        <w:t xml:space="preserve">📌 Kritik Bulgu: Lumora Intelligence'ın algoritma karmaşıklığı büyük oyuncularla </w:t>
       </w:r>
       <w:r>
         <w:rPr>
@@ -4283,15 +4071,7 @@
           <w:sz w:val="44"/>
         </w:rPr>
         <w:lastRenderedPageBreak/>
-        <w:t xml:space="preserve">5. Geliştirme Yol </w:t>
-      </w:r>
-      <w:r>
-        <w:rPr>
-          <w:b/>
-          <w:color w:val="1A1A2E"/>
-          <w:sz w:val="44"/>
-        </w:rPr>
-        <w:t>Haritası</w:t>
+        <w:t>5. Geliştirme Yol Haritası</w:t>
       </w:r>
     </w:p>
     <w:p>
@@ -4351,10 +4131,7 @@
         <w:spacing w:after="60"/>
       </w:pPr>
       <w:r>
-        <w:t xml:space="preserve">Hedef: haftalık 10-20 ürün gerçek satış </w:t>
-      </w:r>
-      <w:r>
-        <w:t>verisi</w:t>
+        <w:t>Hedef: haftalık 10-20 ürün gerçek satış verisi</w:t>
       </w:r>
     </w:p>
     <w:p>
@@ -4394,10 +4171,7 @@
         <w:spacing w:after="60"/>
       </w:pPr>
       <w:r>
-        <w:t xml:space="preserve">Türkiye takvimi: Anneler Günü, Sevgililer Günü, 11.11, yılbaşı → </w:t>
-      </w:r>
-      <w:r>
-        <w:t>otomatik çarpan</w:t>
+        <w:t>Türkiye takvimi: Anneler Günü, Sevgililer Günü, 11.11, yılbaşı → otomatik çarpan</w:t>
       </w:r>
     </w:p>
     <w:p>
@@ -4446,10 +4220,7 @@
         <w:spacing w:after="60"/>
       </w:pPr>
       <w:r>
-        <w:t>Cross-platform consensus: 2+ platform</w:t>
-      </w:r>
-      <w:r>
-        <w:t>da yükseliş = güvenilir TREND sinyali</w:t>
+        <w:t>Cross-platform consensus: 2+ platformda yükseliş = güvenilir TREND sinyali</w:t>
       </w:r>
     </w:p>
     <w:p>
@@ -4510,10 +4281,7 @@
         <w:spacing w:after="60"/>
       </w:pPr>
       <w:r>
-        <w:t>Fea</w:t>
-      </w:r>
-      <w:r>
-        <w:t>ture olarak ekle: social_momentum_3d → trend_score'a %15 ağırlık</w:t>
+        <w:t>Feature olarak ekle: social_momentum_3d → trend_score'a %15 ağırlık</w:t>
       </w:r>
     </w:p>
     <w:p>
@@ -4553,10 +4321,7 @@
         <w:spacing w:after="60"/>
       </w:pPr>
       <w:r>
-        <w:t>Entegrasyon: video_trend</w:t>
-      </w:r>
-      <w:r>
-        <w:t>_score → favorite_growth_3d ile kor-relate et</w:t>
+        <w:t>Entegrasyon: video_trend_score → favorite_growth_3d ile kor-relate et</w:t>
       </w:r>
     </w:p>
     <w:p>
@@ -4618,10 +4383,7 @@
       </w:pPr>
       <w:r>
         <w:lastRenderedPageBreak/>
-        <w:t>Öngörü</w:t>
-      </w:r>
-      <w:r>
-        <w:t>: haftalık trend tahminini 2 haftaya uzatır (%82 güvenle)</w:t>
+        <w:t>Öngörü: haftalık trend tahminini 2 haftaya uzatır (%82 güvenle)</w:t>
       </w:r>
     </w:p>
     <w:p>
@@ -4652,10 +4414,7 @@
         <w:spacing w:after="60"/>
       </w:pPr>
       <w:r>
-        <w:t>Segment bazlı trend: A segmenti (25-35 yaş, şehirli) farklı trend → B segmentin</w:t>
-      </w:r>
-      <w:r>
-        <w:t>den</w:t>
+        <w:t>Segment bazlı trend: A segmenti (25-35 yaş, şehirli) farklı trend → B segmentinden</w:t>
       </w:r>
     </w:p>
     <w:p>
@@ -4714,15 +4473,7 @@
           <w:sz w:val="44"/>
         </w:rPr>
         <w:lastRenderedPageBreak/>
-        <w:t xml:space="preserve">6. </w:t>
-      </w:r>
-      <w:r>
-        <w:rPr>
-          <w:b/>
-          <w:color w:val="1A1A2E"/>
-          <w:sz w:val="44"/>
-        </w:rPr>
-        <w:t>Ticari Değerlendirme</w:t>
+        <w:t>6. Ticari Değerlendirme</w:t>
       </w:r>
     </w:p>
     <w:p>
@@ -4971,13 +4722,7 @@
               <w:rPr>
                 <w:sz w:val="20"/>
               </w:rPr>
-              <w:t xml:space="preserve">Yüksek </w:t>
-            </w:r>
-            <w:r>
-              <w:rPr>
-                <w:sz w:val="20"/>
-              </w:rPr>
-              <w:t>⭐⭐⭐⭐</w:t>
+              <w:t>Yüksek ⭐⭐⭐⭐</w:t>
             </w:r>
           </w:p>
         </w:tc>
@@ -5043,13 +4788,7 @@
               <w:rPr>
                 <w:sz w:val="20"/>
               </w:rPr>
-              <w:t xml:space="preserve">Orta </w:t>
-            </w:r>
-            <w:r>
-              <w:rPr>
-                <w:sz w:val="20"/>
-              </w:rPr>
-              <w:t>⭐⭐⭐</w:t>
+              <w:t>Orta ⭐⭐⭐</w:t>
             </w:r>
           </w:p>
         </w:tc>
@@ -5107,13 +4846,7 @@
               <w:rPr>
                 <w:sz w:val="20"/>
               </w:rPr>
-              <w:t xml:space="preserve">Düşük </w:t>
-            </w:r>
-            <w:r>
-              <w:rPr>
-                <w:sz w:val="20"/>
-              </w:rPr>
-              <w:t>⭐</w:t>
+              <w:t>Düşük ⭐</w:t>
             </w:r>
           </w:p>
         </w:tc>
@@ -5147,10 +4880,7 @@
         <w:spacing w:after="60"/>
       </w:pPr>
       <w:r>
-        <w:t xml:space="preserve">WGSN: $1000-2000/ay </w:t>
-      </w:r>
-      <w:r>
-        <w:t>→ üst segment, genel trend, Türkiye'ye özgü değil</w:t>
+        <w:t>WGSN: $1000-2000/ay → üst segment, genel trend, Türkiye'ye özgü değil</w:t>
       </w:r>
     </w:p>
     <w:p>
@@ -5221,13 +4951,7 @@
           <w:color w:val="0F3C78"/>
         </w:rPr>
         <w:br/>
-        <w:t>gelirinin %</w:t>
-      </w:r>
-      <w:r>
-        <w:rPr>
-          <w:color w:val="0F3C78"/>
-        </w:rPr>
-        <w:t>3-8'i kadar ek kazanım yaratabilir (stok israfı azalması + doğru ürün üretimi).</w:t>
+        <w:t>gelirinin %3-8'i kadar ek kazanım yaratabilir (stok israfı azalması + doğru ürün üretimi).</w:t>
       </w:r>
     </w:p>
     <w:p>
@@ -5631,13 +5355,23 @@
               <w:rPr>
                 <w:sz w:val="20"/>
               </w:rPr>
-              <w:t xml:space="preserve">Sosyal </w:t>
-            </w:r>
+              <w:t>Sosyal Medya Sinyali</w:t>
+            </w:r>
+          </w:p>
+        </w:tc>
+        <w:tc>
+          <w:tcPr>
+            <w:tcW w:w="3168" w:type="dxa"/>
+          </w:tcPr>
+          <w:p>
+            <w:pPr>
+              <w:cnfStyle w:val="000000100000" w:firstRow="0" w:lastRow="0" w:firstColumn="0" w:lastColumn="0" w:oddVBand="0" w:evenVBand="0" w:oddHBand="1" w:evenHBand="0" w:firstRowFirstColumn="0" w:firstRowLastColumn="0" w:lastRowFirstColumn="0" w:lastRowLastColumn="0"/>
+            </w:pPr>
             <w:r>
               <w:rPr>
                 <w:sz w:val="20"/>
               </w:rPr>
-              <w:t>Medya Sinyali</w:t>
+              <w:t>❌ Yok</w:t>
             </w:r>
           </w:p>
         </w:tc>
@@ -5653,35 +5387,7 @@
               <w:rPr>
                 <w:sz w:val="20"/>
               </w:rPr>
-              <w:t>❌</w:t>
-            </w:r>
-            <w:r>
-              <w:rPr>
-                <w:sz w:val="20"/>
-              </w:rPr>
-              <w:t xml:space="preserve"> Yok</w:t>
-            </w:r>
-          </w:p>
-        </w:tc>
-        <w:tc>
-          <w:tcPr>
-            <w:tcW w:w="3168" w:type="dxa"/>
-          </w:tcPr>
-          <w:p>
-            <w:pPr>
-              <w:cnfStyle w:val="000000100000" w:firstRow="0" w:lastRow="0" w:firstColumn="0" w:lastColumn="0" w:oddVBand="0" w:evenVBand="0" w:oddHBand="1" w:evenHBand="0" w:firstRowFirstColumn="0" w:firstRowLastColumn="0" w:lastRowFirstColumn="0" w:lastRowLastColumn="0"/>
-            </w:pPr>
-            <w:r>
-              <w:rPr>
-                <w:sz w:val="20"/>
-              </w:rPr>
-              <w:t>✅</w:t>
-            </w:r>
-            <w:r>
-              <w:rPr>
-                <w:sz w:val="20"/>
-              </w:rPr>
-              <w:t xml:space="preserve"> Instagram + TikTok</w:t>
+              <w:t>✅ Instagram + TikTok</w:t>
             </w:r>
           </w:p>
         </w:tc>
@@ -5716,35 +5422,23 @@
               <w:rPr>
                 <w:sz w:val="20"/>
               </w:rPr>
-              <w:t>❌</w:t>
-            </w:r>
+              <w:t>❌ Manuel</w:t>
+            </w:r>
+          </w:p>
+        </w:tc>
+        <w:tc>
+          <w:tcPr>
+            <w:tcW w:w="3168" w:type="dxa"/>
+          </w:tcPr>
+          <w:p>
+            <w:pPr>
+              <w:cnfStyle w:val="000000000000" w:firstRow="0" w:lastRow="0" w:firstColumn="0" w:lastColumn="0" w:oddVBand="0" w:evenVBand="0" w:oddHBand="0" w:evenHBand="0" w:firstRowFirstColumn="0" w:firstRowLastColumn="0" w:lastRowFirstColumn="0" w:lastRowLastColumn="0"/>
+            </w:pPr>
             <w:r>
               <w:rPr>
                 <w:sz w:val="20"/>
               </w:rPr>
-              <w:t xml:space="preserve"> Manuel</w:t>
-            </w:r>
-          </w:p>
-        </w:tc>
-        <w:tc>
-          <w:tcPr>
-            <w:tcW w:w="3168" w:type="dxa"/>
-          </w:tcPr>
-          <w:p>
-            <w:pPr>
-              <w:cnfStyle w:val="000000000000" w:firstRow="0" w:lastRow="0" w:firstColumn="0" w:lastColumn="0" w:oddVBand="0" w:evenVBand="0" w:oddHBand="0" w:evenHBand="0" w:firstRowFirstColumn="0" w:firstRowLastColumn="0" w:lastRowFirstColumn="0" w:lastRowLastColumn="0"/>
-            </w:pPr>
-            <w:r>
-              <w:rPr>
-                <w:sz w:val="20"/>
-              </w:rPr>
-              <w:t>✅</w:t>
-            </w:r>
-            <w:r>
-              <w:rPr>
-                <w:sz w:val="20"/>
-              </w:rPr>
-              <w:t xml:space="preserve"> Otomatik (Seller API)</w:t>
+              <w:t>✅ Otomatik (Seller API)</w:t>
             </w:r>
           </w:p>
         </w:tc>
@@ -5780,35 +5474,23 @@
               <w:rPr>
                 <w:sz w:val="20"/>
               </w:rPr>
-              <w:t>⚠</w:t>
-            </w:r>
+              <w:t>⚠ Kısmi</w:t>
+            </w:r>
+          </w:p>
+        </w:tc>
+        <w:tc>
+          <w:tcPr>
+            <w:tcW w:w="3168" w:type="dxa"/>
+          </w:tcPr>
+          <w:p>
+            <w:pPr>
+              <w:cnfStyle w:val="000000100000" w:firstRow="0" w:lastRow="0" w:firstColumn="0" w:lastColumn="0" w:oddVBand="0" w:evenVBand="0" w:oddHBand="1" w:evenHBand="0" w:firstRowFirstColumn="0" w:firstRowLastColumn="0" w:lastRowFirstColumn="0" w:lastRowLastColumn="0"/>
+            </w:pPr>
             <w:r>
               <w:rPr>
                 <w:sz w:val="20"/>
               </w:rPr>
-              <w:t xml:space="preserve"> Kısmi</w:t>
-            </w:r>
-          </w:p>
-        </w:tc>
-        <w:tc>
-          <w:tcPr>
-            <w:tcW w:w="3168" w:type="dxa"/>
-          </w:tcPr>
-          <w:p>
-            <w:pPr>
-              <w:cnfStyle w:val="000000100000" w:firstRow="0" w:lastRow="0" w:firstColumn="0" w:lastColumn="0" w:oddVBand="0" w:evenVBand="0" w:oddHBand="1" w:evenHBand="0" w:firstRowFirstColumn="0" w:firstRowLastColumn="0" w:lastRowFirstColumn="0" w:lastRowLastColumn="0"/>
-            </w:pPr>
-            <w:r>
-              <w:rPr>
-                <w:sz w:val="20"/>
-              </w:rPr>
-              <w:t>✅</w:t>
-            </w:r>
-            <w:r>
-              <w:rPr>
-                <w:sz w:val="20"/>
-              </w:rPr>
-              <w:t xml:space="preserve"> Prophet + hava durumu</w:t>
+              <w:t>✅ Prophet + hava durumu</w:t>
             </w:r>
           </w:p>
         </w:tc>
@@ -5843,35 +5525,23 @@
               <w:rPr>
                 <w:sz w:val="20"/>
               </w:rPr>
-              <w:t>❌</w:t>
-            </w:r>
+              <w:t>❌ Yalnızca Trendyol</w:t>
+            </w:r>
+          </w:p>
+        </w:tc>
+        <w:tc>
+          <w:tcPr>
+            <w:tcW w:w="3168" w:type="dxa"/>
+          </w:tcPr>
+          <w:p>
+            <w:pPr>
+              <w:cnfStyle w:val="000000000000" w:firstRow="0" w:lastRow="0" w:firstColumn="0" w:lastColumn="0" w:oddVBand="0" w:evenVBand="0" w:oddHBand="0" w:evenHBand="0" w:firstRowFirstColumn="0" w:firstRowLastColumn="0" w:lastRowFirstColumn="0" w:lastRowLastColumn="0"/>
+            </w:pPr>
             <w:r>
               <w:rPr>
                 <w:sz w:val="20"/>
               </w:rPr>
-              <w:t xml:space="preserve"> Yalnızca Trendyol</w:t>
-            </w:r>
-          </w:p>
-        </w:tc>
-        <w:tc>
-          <w:tcPr>
-            <w:tcW w:w="3168" w:type="dxa"/>
-          </w:tcPr>
-          <w:p>
-            <w:pPr>
-              <w:cnfStyle w:val="000000000000" w:firstRow="0" w:lastRow="0" w:firstColumn="0" w:lastColumn="0" w:oddVBand="0" w:evenVBand="0" w:oddHBand="0" w:evenHBand="0" w:firstRowFirstColumn="0" w:firstRowLastColumn="0" w:lastRowFirstColumn="0" w:lastRowLastColumn="0"/>
-            </w:pPr>
-            <w:r>
-              <w:rPr>
-                <w:sz w:val="20"/>
-              </w:rPr>
-              <w:t>✅</w:t>
-            </w:r>
-            <w:r>
-              <w:rPr>
-                <w:sz w:val="20"/>
-              </w:rPr>
-              <w:t xml:space="preserve"> Çok platform</w:t>
+              <w:t>✅ Çok platform</w:t>
             </w:r>
           </w:p>
         </w:tc>
@@ -5907,35 +5577,23 @@
               <w:rPr>
                 <w:sz w:val="20"/>
               </w:rPr>
-              <w:t>❌</w:t>
-            </w:r>
+              <w:t>❌ Yok</w:t>
+            </w:r>
+          </w:p>
+        </w:tc>
+        <w:tc>
+          <w:tcPr>
+            <w:tcW w:w="3168" w:type="dxa"/>
+          </w:tcPr>
+          <w:p>
+            <w:pPr>
+              <w:cnfStyle w:val="000000100000" w:firstRow="0" w:lastRow="0" w:firstColumn="0" w:lastColumn="0" w:oddVBand="0" w:evenVBand="0" w:oddHBand="1" w:evenHBand="0" w:firstRowFirstColumn="0" w:firstRowLastColumn="0" w:lastRowFirstColumn="0" w:lastRowLastColumn="0"/>
+            </w:pPr>
             <w:r>
               <w:rPr>
                 <w:sz w:val="20"/>
               </w:rPr>
-              <w:t xml:space="preserve"> Yok</w:t>
-            </w:r>
-          </w:p>
-        </w:tc>
-        <w:tc>
-          <w:tcPr>
-            <w:tcW w:w="3168" w:type="dxa"/>
-          </w:tcPr>
-          <w:p>
-            <w:pPr>
-              <w:cnfStyle w:val="000000100000" w:firstRow="0" w:lastRow="0" w:firstColumn="0" w:lastColumn="0" w:oddVBand="0" w:evenVBand="0" w:oddHBand="1" w:evenHBand="0" w:firstRowFirstColumn="0" w:firstRowLastColumn="0" w:lastRowFirstColumn="0" w:lastRowLastColumn="0"/>
-            </w:pPr>
-            <w:r>
-              <w:rPr>
-                <w:sz w:val="20"/>
-              </w:rPr>
-              <w:t>⚠</w:t>
-            </w:r>
-            <w:r>
-              <w:rPr>
-                <w:sz w:val="20"/>
-              </w:rPr>
-              <w:t xml:space="preserve"> NLP yorumu ile kısmi</w:t>
+              <w:t>⚠ NLP yorumu ile kısmi</w:t>
             </w:r>
           </w:p>
         </w:tc>
@@ -5954,13 +5612,7 @@
               <w:rPr>
                 <w:sz w:val="20"/>
               </w:rPr>
-              <w:t>Ticari</w:t>
-            </w:r>
-            <w:r>
-              <w:rPr>
-                <w:sz w:val="20"/>
-              </w:rPr>
-              <w:t xml:space="preserve"> Hazırlık</w:t>
+              <w:t>Ticari Hazırlık</w:t>
             </w:r>
           </w:p>
         </w:tc>
@@ -6008,8 +5660,6 @@
       </w:r>
       <w:r>
         <w:br/>
-      </w:r>
-      <w:r>
         <w:t xml:space="preserve">rekabet edebilir durumdadır. Önümüzdeki dönemde gerçek veri entegrasyonu ve sosyal medya </w:t>
       </w:r>
       <w:r>
@@ -6039,15 +5689,7 @@
           <w:color w:val="999999"/>
           <w:sz w:val="18"/>
         </w:rPr>
-        <w:t>Bu rapor Lumo</w:t>
-      </w:r>
-      <w:r>
-        <w:rPr>
-          <w:i/>
-          <w:color w:val="999999"/>
-          <w:sz w:val="18"/>
-        </w:rPr>
-        <w:t>ra Intelligence sistemi tarafından otomatik üretilmiştir.</w:t>
+        <w:t>Bu rapor Lumora Intelligence sistemi tarafından otomatik üretilmiştir.</w:t>
       </w:r>
     </w:p>
     <w:sectPr>
@@ -6548,11 +6190,6 @@
     <w:lsdException w:name="Book Title" w:uiPriority="33" w:qFormat="1"/>
     <w:lsdException w:name="Bibliography" w:semiHidden="1" w:uiPriority="37" w:unhideWhenUsed="1"/>
     <w:lsdException w:name="TOC Heading" w:semiHidden="1" w:uiPriority="39" w:unhideWhenUsed="1" w:qFormat="1"/>
-    <w:lsdException w:name="Plain Table 5" w:semiHidden="1" w:unhideWhenUsed="1"/>
-    <w:lsdException w:name="Grid Table Light" w:semiHidden="1" w:unhideWhenUsed="1"/>
-    <w:lsdException w:name="Grid Table 1 Light" w:semiHidden="1" w:unhideWhenUsed="1"/>
-    <w:lsdException w:name="Grid Table 2" w:semiHidden="1" w:unhideWhenUsed="1"/>
-    <w:lsdException w:name="Grid Table 3" w:semiHidden="1" w:unhideWhenUsed="1"/>
     <w:lsdException w:name="Grid Table 4" w:uiPriority="49"/>
     <w:lsdException w:name="Grid Table 5 Dark" w:uiPriority="50"/>
     <w:lsdException w:name="Grid Table 6 Colorful" w:uiPriority="51"/>

</xml_diff>